<commit_message>
[ADHOC] Popraw błędy OCR i odtwórz dokumenty DOCX
Skorygowano bezsporne błędy OCR w tomach Markdown, naprawiono osadzanie obrazów i ponownie utworzono oba profile DOCX dla wszystkich dostępnych tomów.

Polecenie: Przepatrz tekst w plikach .md tomów 1-73 pod kątem błędów ortograficznych i literówek, które zapewne wynikają z błędów skanowania i OCR. Następnie wygeneruj ponownie docx-y.

Zadanie #2674 · Asystent Ad hoc
</commit_message>
<xml_diff>
--- a/DOCX/KINDLE/VOLUME03.docx
+++ b/DOCX/KINDLE/VOLUME03.docx
@@ -8628,12 +8628,36 @@
       <w:pPr>
         <w:pStyle w:val="ListText"/>
         <w:numPr>
-          <w:ilvl w:val="1"/>
-          <w:numId w:val="2"/>
+          <w:ilvl w:val="2"/>
+          <w:numId w:val="3"/>
         </w:numPr>
       </w:pPr>
       <w:r>
-        <w:t xml:space="preserve">The Fact and Nature of Sin</w:t>
+        <w:t xml:space="preserve">The New England Controversy on Original Sin</w:t>
+      </w:r>
+    </w:p>
+    <w:p>
+      <w:pPr>
+        <w:pStyle w:val="ListText"/>
+        <w:numPr>
+          <w:ilvl w:val="2"/>
+          <w:numId w:val="4"/>
+        </w:numPr>
+      </w:pPr>
+      <w:r>
+        <w:t xml:space="preserve">Edwards' Life and Literary Sources</w:t>
+      </w:r>
+    </w:p>
+    <w:p>
+      <w:pPr>
+        <w:pStyle w:val="ListText"/>
+        <w:numPr>
+          <w:ilvl w:val="2"/>
+          <w:numId w:val="5"/>
+        </w:numPr>
+      </w:pPr>
+      <w:r>
+        <w:t xml:space="preserve">Exposition of Arguments</w:t>
       </w:r>
     </w:p>
     <w:p>
@@ -8645,7 +8669,7 @@
         </w:numPr>
       </w:pPr>
       <w:r>
-        <w:t xml:space="preserve">The Cause and Transmission of Sin</w:t>
+        <w:t xml:space="preserve">The Fact and Nature of Sin</w:t>
       </w:r>
     </w:p>
     <w:p>
@@ -8657,7 +8681,7 @@
         </w:numPr>
       </w:pPr>
       <w:r>
-        <w:t xml:space="preserve">God the Author of Sin</w:t>
+        <w:t xml:space="preserve">The Cause and Transmission of Sin</w:t>
       </w:r>
     </w:p>
     <w:p>
@@ -8669,7 +8693,7 @@
         </w:numPr>
       </w:pPr>
       <w:r>
-        <w:t xml:space="preserve">Miscellaneous Arguments Answered</w:t>
+        <w:t xml:space="preserve">God the Author of Sin</w:t>
       </w:r>
     </w:p>
     <w:p>
@@ -8681,7 +8705,19 @@
         </w:numPr>
       </w:pPr>
       <w:r>
-        <w:t xml:space="preserve">John Taylor (1694–1761)</w:t>
+        <w:t xml:space="preserve">Miscellaneous Arguments Answered</w:t>
+      </w:r>
+    </w:p>
+    <w:p>
+      <w:pPr>
+        <w:pStyle w:val="ListText"/>
+        <w:numPr>
+          <w:ilvl w:val="1"/>
+          <w:numId w:val="6"/>
+        </w:numPr>
+      </w:pPr>
+      <w:r>
+        <w:t xml:space="preserve">Edwards' Sources</w:t>
       </w:r>
     </w:p>
     <w:p>
@@ -8693,7 +8729,7 @@
         </w:numPr>
       </w:pPr>
       <w:r>
-        <w:t xml:space="preserve">George Turnbull (1698–1748)</w:t>
+        <w:t xml:space="preserve">John Taylor (1694–1761)</w:t>
       </w:r>
     </w:p>
     <w:p>
@@ -8705,7 +8741,7 @@
         </w:numPr>
       </w:pPr>
       <w:r>
-        <w:t xml:space="preserve">Francis Hutcheson (1694–1746)</w:t>
+        <w:t xml:space="preserve">George Turnbull (1698–1748)</w:t>
       </w:r>
     </w:p>
     <w:p>
@@ -8717,7 +8753,7 @@
         </w:numPr>
       </w:pPr>
       <w:r>
-        <w:t xml:space="preserve">John Locke (1632–1704)</w:t>
+        <w:t xml:space="preserve">Francis Hutcheson (1694–1746)</w:t>
       </w:r>
     </w:p>
     <w:p>
@@ -8729,7 +8765,7 @@
         </w:numPr>
       </w:pPr>
       <w:r>
-        <w:t xml:space="preserve">Henry Winder (1693–1752)</w:t>
+        <w:t xml:space="preserve">John Locke (1632–1704)</w:t>
       </w:r>
     </w:p>
     <w:p>
@@ -8741,7 +8777,43 @@
         </w:numPr>
       </w:pPr>
       <w:r>
+        <w:t xml:space="preserve">Henry Winder (1693–1752)</w:t>
+      </w:r>
+    </w:p>
+    <w:p>
+      <w:pPr>
+        <w:pStyle w:val="ListText"/>
+        <w:numPr>
+          <w:ilvl w:val="1"/>
+          <w:numId w:val="2"/>
+        </w:numPr>
+      </w:pPr>
+      <w:r>
         <w:t xml:space="preserve">Other Authors</w:t>
+      </w:r>
+    </w:p>
+    <w:p>
+      <w:pPr>
+        <w:pStyle w:val="ListText"/>
+        <w:numPr>
+          <w:ilvl w:val="1"/>
+          <w:numId w:val="7"/>
+        </w:numPr>
+      </w:pPr>
+      <w:r>
+        <w:t xml:space="preserve">Notes on the Manuscripts and Text</w:t>
+      </w:r>
+    </w:p>
+    <w:p>
+      <w:pPr>
+        <w:pStyle w:val="ListText"/>
+        <w:numPr>
+          <w:ilvl w:val="1"/>
+          <w:numId w:val="8"/>
+        </w:numPr>
+      </w:pPr>
+      <w:r>
+        <w:t xml:space="preserve">Reception and Evaluations of the Original Sin</w:t>
       </w:r>
     </w:p>
     <w:p>

</xml_diff>